<commit_message>
Release Lab 3 and Week 3 materials
</commit_message>
<xml_diff>
--- a/assets/labs/lab-03-report.docx
+++ b/assets/labs/lab-03-report.docx
@@ -7,7 +7,7 @@
         <w:pStyle w:val="Title"/>
       </w:pPr>
       <w:r>
-        <w:t>Lab 3 Report - Inductive Coupling &amp; EMI Containment</w:t>
+        <w:t>Lab 3 Report - Transformers &amp; Breadboard Crosstalk</w:t>
       </w:r>
     </w:p>
     <w:p>
@@ -31,12 +31,12 @@
         <w:pStyle w:val="Heading1"/>
       </w:pPr>
       <w:r>
-        <w:t>Table 1 - Source and Frequency-Dependent Coupling (25)</w:t>
+        <w:t>Table 1 - Intentional Transformer Coupling (25)</w:t>
       </w:r>
     </w:p>
     <w:p>
       <w:r>
-        <w:t>Use measured amplitudes. Calculate Vpickup / Vsource and record fixed geometry and acquisition settings.</w:t>
+        <w:t>Use resistance mode only while the transformer is disconnected. Use AC-voltage mode for powered measurements; do not use a current jack.</w:t>
       </w:r>
     </w:p>
     <w:tbl>
@@ -46,71 +46,49 @@
         <w:tblLook w:firstColumn="1" w:firstRow="1" w:lastColumn="0" w:lastRow="0" w:noHBand="0" w:noVBand="1" w:val="04A0"/>
       </w:tblPr>
       <w:tblGrid>
-        <w:gridCol w:w="1776"/>
-        <w:gridCol w:w="1776"/>
-        <w:gridCol w:w="1776"/>
-        <w:gridCol w:w="1776"/>
-        <w:gridCol w:w="1776"/>
-        <w:gridCol w:w="1776"/>
+        <w:gridCol w:w="2664"/>
+        <w:gridCol w:w="2664"/>
+        <w:gridCol w:w="2664"/>
+        <w:gridCol w:w="2664"/>
       </w:tblGrid>
       <w:tr>
         <w:tc>
           <w:tcPr>
-            <w:tcW w:type="dxa" w:w="1776"/>
+            <w:tcW w:type="dxa" w:w="2664"/>
           </w:tcPr>
           <w:p>
             <w:r>
-              <w:t>Condition</w:t>
+              <w:t>Measurement</w:t>
             </w:r>
           </w:p>
         </w:tc>
         <w:tc>
           <w:tcPr>
-            <w:tcW w:type="dxa" w:w="1776"/>
+            <w:tcW w:type="dxa" w:w="2664"/>
           </w:tcPr>
           <w:p>
             <w:r>
-              <w:t>Frequency</w:t>
+              <w:t>DMM mode</w:t>
             </w:r>
           </w:p>
         </w:tc>
         <w:tc>
           <w:tcPr>
-            <w:tcW w:type="dxa" w:w="1776"/>
+            <w:tcW w:type="dxa" w:w="2664"/>
           </w:tcPr>
           <w:p>
             <w:r>
-              <w:t>Source Vpp</w:t>
+              <w:t>Measured value</w:t>
             </w:r>
           </w:p>
         </w:tc>
         <w:tc>
           <w:tcPr>
-            <w:tcW w:type="dxa" w:w="1776"/>
+            <w:tcW w:type="dxa" w:w="2664"/>
           </w:tcPr>
           <w:p>
             <w:r>
-              <w:t>Pickup Vpp</w:t>
-            </w:r>
-          </w:p>
-        </w:tc>
-        <w:tc>
-          <w:tcPr>
-            <w:tcW w:type="dxa" w:w="1776"/>
-          </w:tcPr>
-          <w:p>
-            <w:r>
-              <w:t>Vpickup / Vsource</w:t>
-            </w:r>
-          </w:p>
-        </w:tc>
-        <w:tc>
-          <w:tcPr>
-            <w:tcW w:type="dxa" w:w="1776"/>
-          </w:tcPr>
-          <w:p>
-            <w:r>
-              <w:t>Fixed geometry/settings</w:t>
+              <w:t>Expected / comparison</w:t>
             </w:r>
           </w:p>
         </w:tc>
@@ -118,41 +96,29 @@
       <w:tr>
         <w:tc>
           <w:tcPr>
-            <w:tcW w:type="dxa" w:w="1776"/>
+            <w:tcW w:type="dxa" w:w="2664"/>
           </w:tcPr>
           <w:p>
             <w:r>
-              <w:t>Source disabled / noise check</w:t>
+              <w:t>Primary winding resistance</w:t>
             </w:r>
           </w:p>
         </w:tc>
         <w:tc>
           <w:tcPr>
-            <w:tcW w:type="dxa" w:w="1776"/>
+            <w:tcW w:type="dxa" w:w="2664"/>
           </w:tcPr>
           <w:p/>
         </w:tc>
         <w:tc>
           <w:tcPr>
-            <w:tcW w:type="dxa" w:w="1776"/>
+            <w:tcW w:type="dxa" w:w="2664"/>
           </w:tcPr>
           <w:p/>
         </w:tc>
         <w:tc>
           <w:tcPr>
-            <w:tcW w:type="dxa" w:w="1776"/>
-          </w:tcPr>
-          <w:p/>
-        </w:tc>
-        <w:tc>
-          <w:tcPr>
-            <w:tcW w:type="dxa" w:w="1776"/>
-          </w:tcPr>
-          <w:p/>
-        </w:tc>
-        <w:tc>
-          <w:tcPr>
-            <w:tcW w:type="dxa" w:w="1776"/>
+            <w:tcW w:type="dxa" w:w="2664"/>
           </w:tcPr>
           <w:p/>
         </w:tc>
@@ -160,41 +126,29 @@
       <w:tr>
         <w:tc>
           <w:tcPr>
-            <w:tcW w:type="dxa" w:w="1776"/>
+            <w:tcW w:type="dxa" w:w="2664"/>
           </w:tcPr>
           <w:p>
             <w:r>
-              <w:t>Baseline frequency</w:t>
+              <w:t>Secondary winding resistance</w:t>
             </w:r>
           </w:p>
         </w:tc>
         <w:tc>
           <w:tcPr>
-            <w:tcW w:type="dxa" w:w="1776"/>
+            <w:tcW w:type="dxa" w:w="2664"/>
           </w:tcPr>
           <w:p/>
         </w:tc>
         <w:tc>
           <w:tcPr>
-            <w:tcW w:type="dxa" w:w="1776"/>
+            <w:tcW w:type="dxa" w:w="2664"/>
           </w:tcPr>
           <w:p/>
         </w:tc>
         <w:tc>
           <w:tcPr>
-            <w:tcW w:type="dxa" w:w="1776"/>
-          </w:tcPr>
-          <w:p/>
-        </w:tc>
-        <w:tc>
-          <w:tcPr>
-            <w:tcW w:type="dxa" w:w="1776"/>
-          </w:tcPr>
-          <w:p/>
-        </w:tc>
-        <w:tc>
-          <w:tcPr>
-            <w:tcW w:type="dxa" w:w="1776"/>
+            <w:tcW w:type="dxa" w:w="2664"/>
           </w:tcPr>
           <w:p/>
         </w:tc>
@@ -202,41 +156,29 @@
       <w:tr>
         <w:tc>
           <w:tcPr>
-            <w:tcW w:type="dxa" w:w="1776"/>
+            <w:tcW w:type="dxa" w:w="2664"/>
           </w:tcPr>
           <w:p>
             <w:r>
-              <w:t>Middle frequency</w:t>
+              <w:t>Primary-to-secondary resistance</w:t>
             </w:r>
           </w:p>
         </w:tc>
         <w:tc>
           <w:tcPr>
-            <w:tcW w:type="dxa" w:w="1776"/>
+            <w:tcW w:type="dxa" w:w="2664"/>
           </w:tcPr>
           <w:p/>
         </w:tc>
         <w:tc>
           <w:tcPr>
-            <w:tcW w:type="dxa" w:w="1776"/>
+            <w:tcW w:type="dxa" w:w="2664"/>
           </w:tcPr>
           <w:p/>
         </w:tc>
         <w:tc>
           <w:tcPr>
-            <w:tcW w:type="dxa" w:w="1776"/>
-          </w:tcPr>
-          <w:p/>
-        </w:tc>
-        <w:tc>
-          <w:tcPr>
-            <w:tcW w:type="dxa" w:w="1776"/>
-          </w:tcPr>
-          <w:p/>
-        </w:tc>
-        <w:tc>
-          <w:tcPr>
-            <w:tcW w:type="dxa" w:w="1776"/>
+            <w:tcW w:type="dxa" w:w="2664"/>
           </w:tcPr>
           <w:p/>
         </w:tc>
@@ -244,41 +186,89 @@
       <w:tr>
         <w:tc>
           <w:tcPr>
-            <w:tcW w:type="dxa" w:w="1776"/>
+            <w:tcW w:type="dxa" w:w="2664"/>
           </w:tcPr>
           <w:p>
             <w:r>
-              <w:t>Highest frequency</w:t>
+              <w:t>Primary AC voltage Vp</w:t>
             </w:r>
           </w:p>
         </w:tc>
         <w:tc>
           <w:tcPr>
-            <w:tcW w:type="dxa" w:w="1776"/>
+            <w:tcW w:type="dxa" w:w="2664"/>
           </w:tcPr>
           <w:p/>
         </w:tc>
         <w:tc>
           <w:tcPr>
-            <w:tcW w:type="dxa" w:w="1776"/>
+            <w:tcW w:type="dxa" w:w="2664"/>
           </w:tcPr>
           <w:p/>
         </w:tc>
         <w:tc>
           <w:tcPr>
-            <w:tcW w:type="dxa" w:w="1776"/>
+            <w:tcW w:type="dxa" w:w="2664"/>
+          </w:tcPr>
+          <w:p/>
+        </w:tc>
+      </w:tr>
+      <w:tr>
+        <w:tc>
+          <w:tcPr>
+            <w:tcW w:type="dxa" w:w="2664"/>
+          </w:tcPr>
+          <w:p>
+            <w:r>
+              <w:t>Secondary AC voltage Vs</w:t>
+            </w:r>
+          </w:p>
+        </w:tc>
+        <w:tc>
+          <w:tcPr>
+            <w:tcW w:type="dxa" w:w="2664"/>
           </w:tcPr>
           <w:p/>
         </w:tc>
         <w:tc>
           <w:tcPr>
-            <w:tcW w:type="dxa" w:w="1776"/>
+            <w:tcW w:type="dxa" w:w="2664"/>
           </w:tcPr>
           <w:p/>
         </w:tc>
         <w:tc>
           <w:tcPr>
-            <w:tcW w:type="dxa" w:w="1776"/>
+            <w:tcW w:type="dxa" w:w="2664"/>
+          </w:tcPr>
+          <w:p/>
+        </w:tc>
+      </w:tr>
+      <w:tr>
+        <w:tc>
+          <w:tcPr>
+            <w:tcW w:type="dxa" w:w="2664"/>
+          </w:tcPr>
+          <w:p>
+            <w:r>
+              <w:t>Voltage ratio Vs / Vp</w:t>
+            </w:r>
+          </w:p>
+        </w:tc>
+        <w:tc>
+          <w:tcPr>
+            <w:tcW w:type="dxa" w:w="2664"/>
+          </w:tcPr>
+          <w:p/>
+        </w:tc>
+        <w:tc>
+          <w:tcPr>
+            <w:tcW w:type="dxa" w:w="2664"/>
+          </w:tcPr>
+          <w:p/>
+        </w:tc>
+        <w:tc>
+          <w:tcPr>
+            <w:tcW w:type="dxa" w:w="2664"/>
           </w:tcPr>
           <w:p/>
         </w:tc>
@@ -286,7 +276,7 @@
     </w:tbl>
     <w:p>
       <w:r>
-        <w:t>What pattern did frequency produce, and which measurements support it?</w:t>
+        <w:t>What do the cross-winding resistance result and the measured voltage ratio each demonstrate?</w:t>
       </w:r>
     </w:p>
     <w:p>
@@ -304,12 +294,12 @@
         <w:pStyle w:val="Heading1"/>
       </w:pPr>
       <w:r>
-        <w:t>Table 2 - Distance and Orientation (20)</w:t>
+        <w:t>Table 2 - Crosstalk Baseline and Orientation (20)</w:t>
       </w:r>
     </w:p>
     <w:p>
       <w:r>
-        <w:t>Change only geometry. Restore and recheck the baseline between changed conditions.</w:t>
+        <w:t>Keep source, resistors, probe factors, scope scales, bandwidth, and acquisition settings fixed while changing conductor orientation.</w:t>
       </w:r>
     </w:p>
     <w:tbl>
@@ -332,7 +322,7 @@
           </w:tcPr>
           <w:p>
             <w:r>
-              <w:t>Geometry</w:t>
+              <w:t>Condition</w:t>
             </w:r>
           </w:p>
         </w:tc>
@@ -342,7 +332,7 @@
           </w:tcPr>
           <w:p>
             <w:r>
-              <w:t>Separation</w:t>
+              <w:t>Source Vpp</w:t>
             </w:r>
           </w:p>
         </w:tc>
@@ -352,7 +342,7 @@
           </w:tcPr>
           <w:p>
             <w:r>
-              <w:t>Orientation</w:t>
+              <w:t>Neighbor Vpp</w:t>
             </w:r>
           </w:p>
         </w:tc>
@@ -362,7 +352,7 @@
           </w:tcPr>
           <w:p>
             <w:r>
-              <w:t>Pickup Vpp</w:t>
+              <w:t>Vneighbor / Vsource</w:t>
             </w:r>
           </w:p>
         </w:tc>
@@ -372,7 +362,7 @@
           </w:tcPr>
           <w:p>
             <w:r>
-              <w:t>Difference from baseline</w:t>
+              <w:t>What changed?</w:t>
             </w:r>
           </w:p>
         </w:tc>
@@ -384,7 +374,7 @@
           </w:tcPr>
           <w:p>
             <w:r>
-              <w:t>Baseline</w:t>
+              <w:t>Source disabled</w:t>
             </w:r>
           </w:p>
         </w:tc>
@@ -420,7 +410,7 @@
           </w:tcPr>
           <w:p>
             <w:r>
-              <w:t>Double distance</w:t>
+              <w:t>Parallel baseline</w:t>
             </w:r>
           </w:p>
         </w:tc>
@@ -456,7 +446,7 @@
           </w:tcPr>
           <w:p>
             <w:r>
-              <w:t>Rotated pickup</w:t>
+              <w:t>90-degree crossing</w:t>
             </w:r>
           </w:p>
         </w:tc>
@@ -492,7 +482,7 @@
           </w:tcPr>
           <w:p>
             <w:r>
-              <w:t>Restored baseline</w:t>
+              <w:t>Restored parallel baseline</w:t>
             </w:r>
           </w:p>
         </w:tc>
@@ -524,7 +514,7 @@
     </w:tbl>
     <w:p>
       <w:r>
-        <w:t>Rank the geometries from greatest to least coupling. Why is a restored baseline important?</w:t>
+        <w:t>Did the 90-degree crossing increase or reduce crosstalk? Cite the measurements and explain why restoring the parallel baseline matters.</w:t>
       </w:r>
     </w:p>
     <w:p>
@@ -538,16 +528,21 @@
       </w:r>
     </w:p>
     <w:p>
+      <w:r>
+        <w:br w:type="page"/>
+      </w:r>
+    </w:p>
+    <w:p>
       <w:pPr>
         <w:pStyle w:val="Heading1"/>
       </w:pPr>
       <w:r>
-        <w:t>Table 3 - Routing and Containment (25)</w:t>
+        <w:t>Table 3 - Neighbor-Line Resistance and Crosstalk (25)</w:t>
       </w:r>
     </w:p>
     <w:p>
       <w:r>
-        <w:t>Hold source, load, route length, pickup position, and scope settings constant.</w:t>
+        <w:t>Restore the parallel baseline. Change only the neighbor-line resistor and keep the source, conductors, and scope settings fixed.</w:t>
       </w:r>
     </w:p>
     <w:tbl>
@@ -570,7 +565,17 @@
           </w:tcPr>
           <w:p>
             <w:r>
-              <w:t>Routing condition</w:t>
+              <w:t>Neighbor condition</w:t>
+            </w:r>
+          </w:p>
+        </w:tc>
+        <w:tc>
+          <w:tcPr>
+            <w:tcW w:type="dxa" w:w="2131"/>
+          </w:tcPr>
+          <w:p>
+            <w:r>
+              <w:t>Resistance</w:t>
             </w:r>
           </w:p>
         </w:tc>
@@ -590,7 +595,7 @@
           </w:tcPr>
           <w:p>
             <w:r>
-              <w:t>Pickup Vpp</w:t>
+              <w:t>Neighbor Vpp</w:t>
             </w:r>
           </w:p>
         </w:tc>
@@ -600,17 +605,7 @@
           </w:tcPr>
           <w:p>
             <w:r>
-              <w:t>Vpickup / Vsource</w:t>
-            </w:r>
-          </w:p>
-        </w:tc>
-        <w:tc>
-          <w:tcPr>
-            <w:tcW w:type="dxa" w:w="2131"/>
-          </w:tcPr>
-          <w:p>
-            <w:r>
-              <w:t>Pickup reduction vs. separated (%)</w:t>
+              <w:t>Reduction vs. high R (%)</w:t>
             </w:r>
           </w:p>
         </w:tc>
@@ -622,7 +617,7 @@
           </w:tcPr>
           <w:p>
             <w:r>
-              <w:t>Separated conductors</w:t>
+              <w:t>High-value neighbor resistor</w:t>
             </w:r>
           </w:p>
         </w:tc>
@@ -658,43 +653,7 @@
           </w:tcPr>
           <w:p>
             <w:r>
-              <w:t>Twisted pair</w:t>
-            </w:r>
-          </w:p>
-        </w:tc>
-        <w:tc>
-          <w:tcPr>
-            <w:tcW w:type="dxa" w:w="2131"/>
-          </w:tcPr>
-          <w:p/>
-        </w:tc>
-        <w:tc>
-          <w:tcPr>
-            <w:tcW w:type="dxa" w:w="2131"/>
-          </w:tcPr>
-          <w:p/>
-        </w:tc>
-        <w:tc>
-          <w:tcPr>
-            <w:tcW w:type="dxa" w:w="2131"/>
-          </w:tcPr>
-          <w:p/>
-        </w:tc>
-        <w:tc>
-          <w:tcPr>
-            <w:tcW w:type="dxa" w:w="2131"/>
-          </w:tcPr>
-          <w:p/>
-        </w:tc>
-      </w:tr>
-      <w:tr>
-        <w:tc>
-          <w:tcPr>
-            <w:tcW w:type="dxa" w:w="2131"/>
-          </w:tcPr>
-          <w:p>
-            <w:r>
-              <w:t>Optional ferrite</w:t>
+              <w:t>Low-value neighbor resistor</w:t>
             </w:r>
           </w:p>
         </w:tc>
@@ -726,7 +685,7 @@
     </w:tbl>
     <w:p>
       <w:r>
-        <w:t>Which routing best contained the signal? State the quantitative evidence.</w:t>
+        <w:t>How did lower neighbor-line resistance affect measured crosstalk? State the quantitative evidence and one design tradeoff.</w:t>
       </w:r>
     </w:p>
     <w:p>
@@ -749,7 +708,7 @@
     </w:p>
     <w:p>
       <w:r>
-        <w:t>Insert readable photographs or screenshots for each condition:</w:t>
+        <w:t>Insert readable photographs or screenshots for the required evidence points:</w:t>
       </w:r>
     </w:p>
     <w:p>
@@ -757,18 +716,16 @@
         <w:pStyle w:val="Heading2"/>
       </w:pPr>
       <w:r>
-        <w:t>Highest-Frequency Condition</w:t>
+        <w:t>Transformer Measurement</w:t>
       </w:r>
     </w:p>
     <w:p>
       <w:r>
-        <w:t>Pictured: Both channels with amplitudes, frequency, and scales visible.</w:t>
+        <w:t>Pictured: Transformer setup, DMM AC-voltage reading, and station card.</w:t>
       </w:r>
     </w:p>
     <w:p>
       <w:r>
-        <w:br/>
-        <w:br/>
         <w:br/>
         <w:br/>
       </w:r>
@@ -778,18 +735,16 @@
         <w:pStyle w:val="Heading2"/>
       </w:pPr>
       <w:r>
-        <w:t>Lowest-Coupling Geometry</w:t>
+        <w:t>Parallel-Wire Baseline</w:t>
       </w:r>
     </w:p>
     <w:p>
       <w:r>
-        <w:t>Pictured: Loop geometry or distance guide with the pickup reading.</w:t>
+        <w:t>Pictured: Parallel source and neighbor conductors with readable Channel 1 and Channel 2 measurements.</w:t>
       </w:r>
     </w:p>
     <w:p>
       <w:r>
-        <w:br/>
-        <w:br/>
         <w:br/>
         <w:br/>
       </w:r>
@@ -799,18 +754,16 @@
         <w:pStyle w:val="Heading2"/>
       </w:pPr>
       <w:r>
-        <w:t>Routing Comparison</w:t>
+        <w:t>Lowest-Crosstalk Condition</w:t>
       </w:r>
     </w:p>
     <w:p>
       <w:r>
-        <w:t>Pictured: Separated and twisted routes with their pickup readings. Two labeled images may be used.</w:t>
+        <w:t>Pictured: The tested orientation or neighbor-resistance condition that produced the lowest repeatable neighbor-line voltage.</w:t>
       </w:r>
     </w:p>
     <w:p>
       <w:r>
-        <w:br/>
-        <w:br/>
         <w:br/>
         <w:br/>
       </w:r>
@@ -838,7 +791,7 @@
         <w:pStyle w:val="ListParagraph"/>
       </w:pPr>
       <w:r>
-        <w:t>Which condition produced the strongest coupling, and what evidence supports it?</w:t>
+        <w:t>How did the transformer demonstrate intentional coupling without a direct DC path between windings?</w:t>
       </w:r>
     </w:p>
     <w:p>
@@ -846,7 +799,7 @@
         <w:pStyle w:val="ListParagraph"/>
       </w:pPr>
       <w:r>
-        <w:t>Which mitigation produced the greatest repeatable percent reduction?</w:t>
+        <w:t>How did you verify that the unwanted waveform on the neighbor line came from the source line?</w:t>
       </w:r>
     </w:p>
     <w:p>
@@ -854,7 +807,7 @@
         <w:pStyle w:val="ListParagraph"/>
       </w:pPr>
       <w:r>
-        <w:t>Name one controlled variable and explain why it matters.</w:t>
+        <w:t>Which tested change reduced crosstalk most, and what quantitative evidence supports that conclusion?</w:t>
       </w:r>
     </w:p>
     <w:p>
@@ -862,7 +815,20 @@
         <w:pStyle w:val="ListParagraph"/>
       </w:pPr>
       <w:r>
-        <w:t>State one supported conclusion and one broader claim this evidence does not prove.</w:t>
+        <w:t>Name one controlled variable and explain why it was necessary for a fair comparison.</w:t>
+      </w:r>
+    </w:p>
+    <w:p>
+      <w:pPr>
+        <w:pStyle w:val="ListParagraph"/>
+      </w:pPr>
+      <w:r>
+        <w:t>State one broader claim about interception, isolation, or signal containment that this evidence does not prove.</w:t>
+      </w:r>
+    </w:p>
+    <w:p>
+      <w:r>
+        <w:t>________________________________________________________________________________</w:t>
       </w:r>
     </w:p>
     <w:p>

</xml_diff>

<commit_message>
Clarify Lab 3 transformer and crosstalk setup
</commit_message>
<xml_diff>
--- a/assets/labs/lab-03-report.docx
+++ b/assets/labs/lab-03-report.docx
@@ -37,6 +37,11 @@
     <w:p>
       <w:r>
         <w:t>Use resistance mode only while the transformer is disconnected. Use AC-voltage mode for powered measurements; do not use a current jack.</w:t>
+      </w:r>
+    </w:p>
+    <w:p>
+      <w:r>
+        <w:t>Transformer model: ______________________________</w:t>
       </w:r>
     </w:p>
     <w:tbl>
@@ -100,6 +105,96 @@
           </w:tcPr>
           <w:p>
             <w:r>
+              <w:t>Nameplate primary voltage</w:t>
+            </w:r>
+          </w:p>
+        </w:tc>
+        <w:tc>
+          <w:tcPr>
+            <w:tcW w:type="dxa" w:w="2664"/>
+          </w:tcPr>
+          <w:p/>
+        </w:tc>
+        <w:tc>
+          <w:tcPr>
+            <w:tcW w:type="dxa" w:w="2664"/>
+          </w:tcPr>
+          <w:p/>
+        </w:tc>
+        <w:tc>
+          <w:tcPr>
+            <w:tcW w:type="dxa" w:w="2664"/>
+          </w:tcPr>
+          <w:p/>
+        </w:tc>
+      </w:tr>
+      <w:tr>
+        <w:tc>
+          <w:tcPr>
+            <w:tcW w:type="dxa" w:w="2664"/>
+          </w:tcPr>
+          <w:p>
+            <w:r>
+              <w:t>Nameplate full-secondary voltage</w:t>
+            </w:r>
+          </w:p>
+        </w:tc>
+        <w:tc>
+          <w:tcPr>
+            <w:tcW w:type="dxa" w:w="2664"/>
+          </w:tcPr>
+          <w:p/>
+        </w:tc>
+        <w:tc>
+          <w:tcPr>
+            <w:tcW w:type="dxa" w:w="2664"/>
+          </w:tcPr>
+          <w:p/>
+        </w:tc>
+        <w:tc>
+          <w:tcPr>
+            <w:tcW w:type="dxa" w:w="2664"/>
+          </w:tcPr>
+          <w:p/>
+        </w:tc>
+      </w:tr>
+      <w:tr>
+        <w:tc>
+          <w:tcPr>
+            <w:tcW w:type="dxa" w:w="2664"/>
+          </w:tcPr>
+          <w:p>
+            <w:r>
+              <w:t>Expected ratio: rated secondary / rated primary</w:t>
+            </w:r>
+          </w:p>
+        </w:tc>
+        <w:tc>
+          <w:tcPr>
+            <w:tcW w:type="dxa" w:w="2664"/>
+          </w:tcPr>
+          <w:p/>
+        </w:tc>
+        <w:tc>
+          <w:tcPr>
+            <w:tcW w:type="dxa" w:w="2664"/>
+          </w:tcPr>
+          <w:p/>
+        </w:tc>
+        <w:tc>
+          <w:tcPr>
+            <w:tcW w:type="dxa" w:w="2664"/>
+          </w:tcPr>
+          <w:p/>
+        </w:tc>
+      </w:tr>
+      <w:tr>
+        <w:tc>
+          <w:tcPr>
+            <w:tcW w:type="dxa" w:w="2664"/>
+          </w:tcPr>
+          <w:p>
+            <w:r>
               <w:t>Primary winding resistance</w:t>
             </w:r>
           </w:p>
@@ -130,7 +225,7 @@
           </w:tcPr>
           <w:p>
             <w:r>
-              <w:t>Secondary winding resistance</w:t>
+              <w:t>Full-secondary winding resistance</w:t>
             </w:r>
           </w:p>
         </w:tc>
@@ -250,7 +345,7 @@
           </w:tcPr>
           <w:p>
             <w:r>
-              <w:t>Voltage ratio Vs / Vp</w:t>
+              <w:t>Measured voltage ratio Vs / Vp</w:t>
             </w:r>
           </w:p>
         </w:tc>
@@ -300,6 +395,11 @@
     <w:p>
       <w:r>
         <w:t>Keep source, resistors, probe factors, scope scales, bandwidth, and acquisition settings fixed while changing conductor orientation.</w:t>
+      </w:r>
+    </w:p>
+    <w:p>
+      <w:r>
+        <w:t>Record the assigned source settings: waveform __________  frequency __________  amplitude __________  offset __________</w:t>
       </w:r>
     </w:p>
     <w:tbl>
@@ -721,7 +821,7 @@
     </w:p>
     <w:p>
       <w:r>
-        <w:t>Pictured: Transformer setup, DMM AC-voltage reading, and station card.</w:t>
+        <w:t>Pictured: Transformer setup, labeled winding leads, and DMM AC-voltage reading.</w:t>
       </w:r>
     </w:p>
     <w:p>

</xml_diff>

<commit_message>
Add Lab 3 recovery guidance and report formatting
</commit_message>
<xml_diff>
--- a/assets/labs/lab-03-report.docx
+++ b/assets/labs/lab-03-report.docx
@@ -7,7 +7,16 @@
         <w:pStyle w:val="Title"/>
       </w:pPr>
       <w:r>
-        <w:t>Lab 3 Report - Transformers &amp; Breadboard Crosstalk</w:t>
+        <w:t>Lab 3 Report - Coupling and Crosstalk</w:t>
+      </w:r>
+      <w:r>
+        <w:t xml:space="preserve"/>
+      </w:r>
+      <w:r>
+        <w:t/>
+      </w:r>
+      <w:r>
+        <w:t/>
       </w:r>
     </w:p>
     <w:p>
@@ -15,15 +24,19 @@
         <w:pStyle w:val="Heading2"/>
       </w:pPr>
       <w:r>
-        <w:t xml:space="preserve">Name: </w:t>
+        <w:t xml:space="preserve">Name:</w:t>
       </w:r>
     </w:p>
     <w:p>
       <w:pPr>
         <w:pStyle w:val="ListBullet"/>
+        <w:numPr>
+          <w:ilvl w:val="0"/>
+          <w:numId w:val="0"/>
+        </w:numPr>
       </w:pPr>
       <w:r>
-        <w:t xml:space="preserve">Lab Partners: </w:t>
+        <w:t xml:space="preserve">Lab Partners:</w:t>
       </w:r>
     </w:p>
     <w:p>
@@ -33,598 +46,718 @@
       <w:r>
         <w:t>Table 1 - Intentional Transformer Coupling (25)</w:t>
       </w:r>
+      <w:r>
+        <w:t xml:space="preserve"/>
+      </w:r>
     </w:p>
     <w:p>
       <w:r>
         <w:t>Use resistance mode only while the transformer is disconnected. Use AC-voltage mode for powered measurements; do not use a current jack.</w:t>
       </w:r>
     </w:p>
-    <w:p>
-      <w:r>
-        <w:t>Transformer model: ______________________________</w:t>
-      </w:r>
-    </w:p>
     <w:tbl>
       <w:tblPr>
         <w:tblStyle w:val="TableGrid"/>
-        <w:tblW w:type="auto" w:w="0"/>
-        <w:tblLook w:firstColumn="1" w:firstRow="1" w:lastColumn="0" w:lastRow="0" w:noHBand="0" w:noVBand="1" w:val="04A0"/>
+        <w:tblW w:w="11187" w:type="dxa"/>
+        <w:tblLook w:val="04A0" w:firstRow="1" w:lastRow="0" w:firstColumn="1" w:lastColumn="0" w:noHBand="0" w:noVBand="1"/>
       </w:tblPr>
       <w:tblGrid>
-        <w:gridCol w:w="2664"/>
-        <w:gridCol w:w="2664"/>
-        <w:gridCol w:w="2664"/>
-        <w:gridCol w:w="2664"/>
+        <w:gridCol w:w="2178"/>
+        <w:gridCol w:w="2579"/>
+        <w:gridCol w:w="2809"/>
+        <w:gridCol w:w="3621"/>
       </w:tblGrid>
       <w:tr>
+        <w:trPr>
+          <w:trHeight w:val="432"/>
+          <w:tblHeader/>
+        </w:trPr>
         <w:tc>
           <w:tcPr>
-            <w:tcW w:type="dxa" w:w="2664"/>
+            <w:tcW w:w="2178" w:type="dxa"/>
+            <w:shd w:val="clear" w:color="auto" w:fill="17324D"/>
+            <w:vAlign w:val="center"/>
           </w:tcPr>
           <w:p>
             <w:r>
+              <w:rPr>
+                <w:b/>
+                <w:color w:val="FFFFFF"/>
+              </w:rPr>
               <w:t>Measurement</w:t>
             </w:r>
           </w:p>
         </w:tc>
         <w:tc>
           <w:tcPr>
-            <w:tcW w:type="dxa" w:w="2664"/>
+            <w:tcW w:w="2579" w:type="dxa"/>
+            <w:shd w:val="clear" w:color="auto" w:fill="17324D"/>
+            <w:vAlign w:val="center"/>
           </w:tcPr>
           <w:p>
             <w:r>
-              <w:t>DMM mode</w:t>
+              <w:rPr>
+                <w:b/>
+                <w:color w:val="FFFFFF"/>
+              </w:rPr>
+              <w:t>Method / mode</w:t>
             </w:r>
           </w:p>
         </w:tc>
         <w:tc>
           <w:tcPr>
-            <w:tcW w:type="dxa" w:w="2664"/>
+            <w:tcW w:w="2809" w:type="dxa"/>
+            <w:shd w:val="clear" w:color="auto" w:fill="17324D"/>
+            <w:vAlign w:val="center"/>
           </w:tcPr>
           <w:p>
             <w:r>
-              <w:t>Measured value</w:t>
+              <w:rPr>
+                <w:b/>
+                <w:color w:val="FFFFFF"/>
+              </w:rPr>
+              <w:t>Measured or rated value</w:t>
             </w:r>
           </w:p>
         </w:tc>
         <w:tc>
           <w:tcPr>
-            <w:tcW w:type="dxa" w:w="2664"/>
+            <w:tcW w:w="3621" w:type="dxa"/>
+            <w:shd w:val="clear" w:color="auto" w:fill="17324D"/>
+            <w:vAlign w:val="center"/>
           </w:tcPr>
           <w:p>
             <w:r>
+              <w:rPr>
+                <w:b/>
+                <w:color w:val="FFFFFF"/>
+              </w:rPr>
               <w:t>Expected / comparison</w:t>
             </w:r>
           </w:p>
         </w:tc>
       </w:tr>
       <w:tr>
+        <w:trPr>
+          <w:trHeight w:val="490"/>
+        </w:trPr>
         <w:tc>
           <w:tcPr>
-            <w:tcW w:type="dxa" w:w="2664"/>
+            <w:tcW w:w="2178" w:type="dxa"/>
+            <w:vAlign w:val="center"/>
           </w:tcPr>
           <w:p>
             <w:r>
+              <w:rPr>
+                <w:b w:val="0"/>
+              </w:rPr>
+              <w:t>Transformer model</w:t>
+            </w:r>
+          </w:p>
+        </w:tc>
+        <w:tc>
+          <w:tcPr>
+            <w:tcW w:w="2579" w:type="dxa"/>
+            <w:vAlign w:val="center"/>
+          </w:tcPr>
+          <w:p>
+            <w:r>
+              <w:rPr>
+                <w:b w:val="0"/>
+              </w:rPr>
+            </w:r>
+          </w:p>
+        </w:tc>
+        <w:tc>
+          <w:tcPr>
+            <w:tcW w:w="2809" w:type="dxa"/>
+            <w:vAlign w:val="center"/>
+          </w:tcPr>
+          <w:p>
+            <w:r>
+              <w:rPr>
+                <w:b w:val="0"/>
+              </w:rPr>
+            </w:r>
+          </w:p>
+        </w:tc>
+        <w:tc>
+          <w:tcPr>
+            <w:tcW w:w="3621" w:type="dxa"/>
+          </w:tcPr>
+          <w:p>
+            <w:r>
+              <w:rPr>
+                <w:b w:val="0"/>
+              </w:rPr>
+            </w:r>
+          </w:p>
+        </w:tc>
+      </w:tr>
+      <w:tr>
+        <w:trPr>
+          <w:trHeight w:val="490"/>
+        </w:trPr>
+        <w:tc>
+          <w:tcPr>
+            <w:tcW w:w="2178" w:type="dxa"/>
+            <w:vAlign w:val="center"/>
+          </w:tcPr>
+          <w:p>
+            <w:r>
+              <w:rPr>
+                <w:b w:val="0"/>
+              </w:rPr>
               <w:t>Nameplate primary voltage</w:t>
             </w:r>
           </w:p>
         </w:tc>
         <w:tc>
           <w:tcPr>
-            <w:tcW w:type="dxa" w:w="2664"/>
+            <w:tcW w:w="2579" w:type="dxa"/>
+            <w:vAlign w:val="center"/>
           </w:tcPr>
-          <w:p/>
+          <w:p>
+            <w:r>
+              <w:rPr>
+                <w:b w:val="0"/>
+              </w:rPr>
+            </w:r>
+          </w:p>
         </w:tc>
         <w:tc>
           <w:tcPr>
-            <w:tcW w:type="dxa" w:w="2664"/>
+            <w:tcW w:w="2809" w:type="dxa"/>
+            <w:vAlign w:val="center"/>
           </w:tcPr>
-          <w:p/>
+          <w:p>
+            <w:r>
+              <w:rPr>
+                <w:b w:val="0"/>
+              </w:rPr>
+            </w:r>
+          </w:p>
         </w:tc>
         <w:tc>
           <w:tcPr>
-            <w:tcW w:type="dxa" w:w="2664"/>
+            <w:tcW w:w="3621" w:type="dxa"/>
           </w:tcPr>
-          <w:p/>
+          <w:p>
+            <w:r>
+              <w:rPr>
+                <w:b w:val="0"/>
+              </w:rPr>
+            </w:r>
+          </w:p>
         </w:tc>
       </w:tr>
       <w:tr>
+        <w:trPr>
+          <w:trHeight w:val="490"/>
+        </w:trPr>
         <w:tc>
           <w:tcPr>
-            <w:tcW w:type="dxa" w:w="2664"/>
+            <w:tcW w:w="2178" w:type="dxa"/>
+            <w:shd w:val="clear" w:color="auto" w:fill="EAF2F7"/>
+            <w:vAlign w:val="center"/>
           </w:tcPr>
           <w:p>
             <w:r>
+              <w:rPr>
+                <w:b w:val="0"/>
+              </w:rPr>
               <w:t>Nameplate full-secondary voltage</w:t>
             </w:r>
           </w:p>
         </w:tc>
         <w:tc>
           <w:tcPr>
-            <w:tcW w:type="dxa" w:w="2664"/>
+            <w:tcW w:w="2579" w:type="dxa"/>
+            <w:shd w:val="clear" w:color="auto" w:fill="EAF2F7"/>
+            <w:vAlign w:val="center"/>
           </w:tcPr>
-          <w:p/>
+          <w:p>
+            <w:r>
+              <w:rPr>
+                <w:b w:val="0"/>
+              </w:rPr>
+            </w:r>
+          </w:p>
         </w:tc>
         <w:tc>
           <w:tcPr>
-            <w:tcW w:type="dxa" w:w="2664"/>
+            <w:tcW w:w="2809" w:type="dxa"/>
+            <w:shd w:val="clear" w:color="auto" w:fill="EAF2F7"/>
+            <w:vAlign w:val="center"/>
           </w:tcPr>
-          <w:p/>
+          <w:p>
+            <w:r>
+              <w:rPr>
+                <w:b w:val="0"/>
+              </w:rPr>
+            </w:r>
+          </w:p>
         </w:tc>
         <w:tc>
           <w:tcPr>
-            <w:tcW w:type="dxa" w:w="2664"/>
+            <w:tcW w:w="3621" w:type="dxa"/>
+            <w:shd w:val="clear" w:color="auto" w:fill="EAF2F7"/>
           </w:tcPr>
-          <w:p/>
+          <w:p>
+            <w:r>
+              <w:rPr>
+                <w:b w:val="0"/>
+              </w:rPr>
+            </w:r>
+          </w:p>
         </w:tc>
       </w:tr>
       <w:tr>
+        <w:trPr>
+          <w:trHeight w:val="490"/>
+        </w:trPr>
         <w:tc>
           <w:tcPr>
-            <w:tcW w:type="dxa" w:w="2664"/>
+            <w:tcW w:w="2178" w:type="dxa"/>
+            <w:vAlign w:val="center"/>
           </w:tcPr>
           <w:p>
             <w:r>
+              <w:rPr>
+                <w:b w:val="0"/>
+              </w:rPr>
               <w:t>Expected ratio: rated secondary / rated primary</w:t>
             </w:r>
           </w:p>
         </w:tc>
         <w:tc>
           <w:tcPr>
-            <w:tcW w:type="dxa" w:w="2664"/>
+            <w:tcW w:w="2579" w:type="dxa"/>
+            <w:vAlign w:val="center"/>
           </w:tcPr>
-          <w:p/>
+          <w:p>
+            <w:r>
+              <w:rPr>
+                <w:b w:val="0"/>
+              </w:rPr>
+            </w:r>
+          </w:p>
         </w:tc>
         <w:tc>
           <w:tcPr>
-            <w:tcW w:type="dxa" w:w="2664"/>
+            <w:tcW w:w="2809" w:type="dxa"/>
+            <w:vAlign w:val="center"/>
           </w:tcPr>
-          <w:p/>
+          <w:p>
+            <w:r>
+              <w:rPr>
+                <w:b w:val="0"/>
+              </w:rPr>
+            </w:r>
+          </w:p>
         </w:tc>
         <w:tc>
           <w:tcPr>
-            <w:tcW w:type="dxa" w:w="2664"/>
+            <w:tcW w:w="3621" w:type="dxa"/>
           </w:tcPr>
-          <w:p/>
+          <w:p>
+            <w:r>
+              <w:rPr>
+                <w:b w:val="0"/>
+              </w:rPr>
+            </w:r>
+          </w:p>
         </w:tc>
       </w:tr>
       <w:tr>
+        <w:trPr>
+          <w:trHeight w:val="490"/>
+        </w:trPr>
         <w:tc>
           <w:tcPr>
-            <w:tcW w:type="dxa" w:w="2664"/>
+            <w:tcW w:w="2178" w:type="dxa"/>
+            <w:shd w:val="clear" w:color="auto" w:fill="EAF2F7"/>
+            <w:vAlign w:val="center"/>
           </w:tcPr>
           <w:p>
             <w:r>
+              <w:rPr>
+                <w:b w:val="0"/>
+              </w:rPr>
               <w:t>Primary winding resistance</w:t>
             </w:r>
           </w:p>
         </w:tc>
         <w:tc>
           <w:tcPr>
-            <w:tcW w:type="dxa" w:w="2664"/>
+            <w:tcW w:w="2579" w:type="dxa"/>
+            <w:shd w:val="clear" w:color="auto" w:fill="EAF2F7"/>
+            <w:vAlign w:val="center"/>
           </w:tcPr>
-          <w:p/>
+          <w:p>
+            <w:r>
+              <w:rPr>
+                <w:b w:val="0"/>
+              </w:rPr>
+            </w:r>
+          </w:p>
         </w:tc>
         <w:tc>
           <w:tcPr>
-            <w:tcW w:type="dxa" w:w="2664"/>
+            <w:tcW w:w="2809" w:type="dxa"/>
+            <w:shd w:val="clear" w:color="auto" w:fill="EAF2F7"/>
+            <w:vAlign w:val="center"/>
           </w:tcPr>
-          <w:p/>
+          <w:p>
+            <w:r>
+              <w:rPr>
+                <w:b w:val="0"/>
+              </w:rPr>
+            </w:r>
+          </w:p>
         </w:tc>
         <w:tc>
           <w:tcPr>
-            <w:tcW w:type="dxa" w:w="2664"/>
+            <w:tcW w:w="3621" w:type="dxa"/>
+            <w:shd w:val="clear" w:color="auto" w:fill="EAF2F7"/>
           </w:tcPr>
-          <w:p/>
+          <w:p>
+            <w:r>
+              <w:rPr>
+                <w:b w:val="0"/>
+              </w:rPr>
+            </w:r>
+          </w:p>
         </w:tc>
       </w:tr>
       <w:tr>
+        <w:trPr>
+          <w:trHeight w:val="490"/>
+        </w:trPr>
         <w:tc>
           <w:tcPr>
-            <w:tcW w:type="dxa" w:w="2664"/>
+            <w:tcW w:w="2178" w:type="dxa"/>
+            <w:vAlign w:val="center"/>
           </w:tcPr>
           <w:p>
             <w:r>
+              <w:rPr>
+                <w:b w:val="0"/>
+              </w:rPr>
               <w:t>Full-secondary winding resistance</w:t>
             </w:r>
           </w:p>
         </w:tc>
         <w:tc>
           <w:tcPr>
-            <w:tcW w:type="dxa" w:w="2664"/>
+            <w:tcW w:w="2579" w:type="dxa"/>
+            <w:vAlign w:val="center"/>
           </w:tcPr>
-          <w:p/>
+          <w:p>
+            <w:r>
+              <w:rPr>
+                <w:b w:val="0"/>
+              </w:rPr>
+            </w:r>
+          </w:p>
         </w:tc>
         <w:tc>
           <w:tcPr>
-            <w:tcW w:type="dxa" w:w="2664"/>
+            <w:tcW w:w="2809" w:type="dxa"/>
+            <w:vAlign w:val="center"/>
           </w:tcPr>
-          <w:p/>
+          <w:p>
+            <w:r>
+              <w:rPr>
+                <w:b w:val="0"/>
+              </w:rPr>
+            </w:r>
+          </w:p>
         </w:tc>
         <w:tc>
           <w:tcPr>
-            <w:tcW w:type="dxa" w:w="2664"/>
+            <w:tcW w:w="3621" w:type="dxa"/>
           </w:tcPr>
-          <w:p/>
+          <w:p>
+            <w:r>
+              <w:rPr>
+                <w:b w:val="0"/>
+              </w:rPr>
+            </w:r>
+          </w:p>
         </w:tc>
       </w:tr>
       <w:tr>
+        <w:trPr>
+          <w:trHeight w:val="490"/>
+        </w:trPr>
         <w:tc>
           <w:tcPr>
-            <w:tcW w:type="dxa" w:w="2664"/>
+            <w:tcW w:w="2178" w:type="dxa"/>
+            <w:vAlign w:val="center"/>
           </w:tcPr>
           <w:p>
             <w:r>
+              <w:rPr>
+                <w:b w:val="0"/>
+              </w:rPr>
               <w:t>Primary-to-secondary resistance</w:t>
             </w:r>
           </w:p>
         </w:tc>
         <w:tc>
           <w:tcPr>
-            <w:tcW w:type="dxa" w:w="2664"/>
-          </w:tcPr>
-          <w:p/>
-        </w:tc>
-        <w:tc>
-          <w:tcPr>
-            <w:tcW w:type="dxa" w:w="2664"/>
-          </w:tcPr>
-          <w:p/>
-        </w:tc>
-        <w:tc>
-          <w:tcPr>
-            <w:tcW w:type="dxa" w:w="2664"/>
-          </w:tcPr>
-          <w:p/>
-        </w:tc>
-      </w:tr>
-      <w:tr>
-        <w:tc>
-          <w:tcPr>
-            <w:tcW w:type="dxa" w:w="2664"/>
+            <w:tcW w:w="2579" w:type="dxa"/>
+            <w:vAlign w:val="center"/>
           </w:tcPr>
           <w:p>
             <w:r>
-              <w:t>Primary AC voltage Vp</w:t>
+              <w:rPr>
+                <w:b w:val="0"/>
+              </w:rPr>
             </w:r>
           </w:p>
         </w:tc>
         <w:tc>
           <w:tcPr>
-            <w:tcW w:type="dxa" w:w="2664"/>
-          </w:tcPr>
-          <w:p/>
-        </w:tc>
-        <w:tc>
-          <w:tcPr>
-            <w:tcW w:type="dxa" w:w="2664"/>
-          </w:tcPr>
-          <w:p/>
-        </w:tc>
-        <w:tc>
-          <w:tcPr>
-            <w:tcW w:type="dxa" w:w="2664"/>
-          </w:tcPr>
-          <w:p/>
-        </w:tc>
-      </w:tr>
-      <w:tr>
-        <w:tc>
-          <w:tcPr>
-            <w:tcW w:type="dxa" w:w="2664"/>
+            <w:tcW w:w="2809" w:type="dxa"/>
+            <w:vAlign w:val="center"/>
           </w:tcPr>
           <w:p>
             <w:r>
-              <w:t>Secondary AC voltage Vs</w:t>
+              <w:rPr>
+                <w:b w:val="0"/>
+              </w:rPr>
             </w:r>
           </w:p>
         </w:tc>
         <w:tc>
           <w:tcPr>
-            <w:tcW w:type="dxa" w:w="2664"/>
+            <w:tcW w:w="3621" w:type="dxa"/>
           </w:tcPr>
-          <w:p/>
-        </w:tc>
-        <w:tc>
-          <w:tcPr>
-            <w:tcW w:type="dxa" w:w="2664"/>
-          </w:tcPr>
-          <w:p/>
-        </w:tc>
-        <w:tc>
-          <w:tcPr>
-            <w:tcW w:type="dxa" w:w="2664"/>
-          </w:tcPr>
-          <w:p/>
+          <w:p>
+            <w:r>
+              <w:rPr>
+                <w:b w:val="0"/>
+              </w:rPr>
+            </w:r>
+          </w:p>
         </w:tc>
       </w:tr>
       <w:tr>
+        <w:trPr>
+          <w:trHeight w:val="490"/>
+        </w:trPr>
         <w:tc>
           <w:tcPr>
-            <w:tcW w:type="dxa" w:w="2664"/>
+            <w:tcW w:w="2178" w:type="dxa"/>
+            <w:shd w:val="clear" w:color="auto" w:fill="EAF2F7"/>
+            <w:vAlign w:val="center"/>
           </w:tcPr>
           <w:p>
             <w:r>
-              <w:t>Measured voltage ratio Vs / Vp</w:t>
+              <w:rPr>
+                <w:b w:val="0"/>
+              </w:rPr>
+              <w:t>Primary AC voltage (Vp)</w:t>
             </w:r>
           </w:p>
         </w:tc>
         <w:tc>
           <w:tcPr>
-            <w:tcW w:type="dxa" w:w="2664"/>
-          </w:tcPr>
-          <w:p/>
-        </w:tc>
-        <w:tc>
-          <w:tcPr>
-            <w:tcW w:type="dxa" w:w="2664"/>
-          </w:tcPr>
-          <w:p/>
-        </w:tc>
-        <w:tc>
-          <w:tcPr>
-            <w:tcW w:type="dxa" w:w="2664"/>
-          </w:tcPr>
-          <w:p/>
-        </w:tc>
-      </w:tr>
-    </w:tbl>
-    <w:p>
-      <w:r>
-        <w:t>What do the cross-winding resistance result and the measured voltage ratio each demonstrate?</w:t>
-      </w:r>
-    </w:p>
-    <w:p>
-      <w:r>
-        <w:t>________________________________________________________________________________</w:t>
-      </w:r>
-    </w:p>
-    <w:p>
-      <w:r>
-        <w:t>________________________________________________________________________________</w:t>
-      </w:r>
-    </w:p>
-    <w:p>
-      <w:pPr>
-        <w:pStyle w:val="Heading1"/>
-      </w:pPr>
-      <w:r>
-        <w:t>Table 2 - Crosstalk Baseline and Orientation (20)</w:t>
-      </w:r>
-    </w:p>
-    <w:p>
-      <w:r>
-        <w:t>Keep source, resistors, probe factors, scope scales, bandwidth, and acquisition settings fixed while changing conductor orientation.</w:t>
-      </w:r>
-    </w:p>
-    <w:p>
-      <w:r>
-        <w:t>Record the assigned source settings: waveform __________  frequency __________  amplitude __________  offset __________</w:t>
-      </w:r>
-    </w:p>
-    <w:tbl>
-      <w:tblPr>
-        <w:tblStyle w:val="TableGrid"/>
-        <w:tblW w:type="auto" w:w="0"/>
-        <w:tblLook w:firstColumn="1" w:firstRow="1" w:lastColumn="0" w:lastRow="0" w:noHBand="0" w:noVBand="1" w:val="04A0"/>
-      </w:tblPr>
-      <w:tblGrid>
-        <w:gridCol w:w="2131"/>
-        <w:gridCol w:w="2131"/>
-        <w:gridCol w:w="2131"/>
-        <w:gridCol w:w="2131"/>
-        <w:gridCol w:w="2131"/>
-      </w:tblGrid>
-      <w:tr>
-        <w:tc>
-          <w:tcPr>
-            <w:tcW w:type="dxa" w:w="2131"/>
+            <w:tcW w:w="2579" w:type="dxa"/>
+            <w:shd w:val="clear" w:color="auto" w:fill="EAF2F7"/>
+            <w:vAlign w:val="center"/>
           </w:tcPr>
           <w:p>
             <w:r>
-              <w:t>Condition</w:t>
+              <w:rPr>
+                <w:b w:val="0"/>
+              </w:rPr>
             </w:r>
           </w:p>
         </w:tc>
         <w:tc>
           <w:tcPr>
-            <w:tcW w:type="dxa" w:w="2131"/>
+            <w:tcW w:w="2809" w:type="dxa"/>
+            <w:shd w:val="clear" w:color="auto" w:fill="EAF2F7"/>
+            <w:vAlign w:val="center"/>
           </w:tcPr>
           <w:p>
             <w:r>
-              <w:t>Source Vpp</w:t>
+              <w:rPr>
+                <w:b w:val="0"/>
+              </w:rPr>
             </w:r>
           </w:p>
         </w:tc>
         <w:tc>
           <w:tcPr>
-            <w:tcW w:type="dxa" w:w="2131"/>
+            <w:tcW w:w="3621" w:type="dxa"/>
+            <w:shd w:val="clear" w:color="auto" w:fill="EAF2F7"/>
           </w:tcPr>
           <w:p>
             <w:r>
-              <w:t>Neighbor Vpp</w:t>
+              <w:rPr>
+                <w:b w:val="0"/>
+              </w:rPr>
+            </w:r>
+          </w:p>
+        </w:tc>
+      </w:tr>
+      <w:tr>
+        <w:trPr>
+          <w:trHeight w:val="490"/>
+        </w:trPr>
+        <w:tc>
+          <w:tcPr>
+            <w:tcW w:w="2178" w:type="dxa"/>
+            <w:shd w:val="clear" w:color="auto" w:fill="EAF2F7"/>
+            <w:vAlign w:val="center"/>
+          </w:tcPr>
+          <w:p>
+            <w:r>
+              <w:rPr>
+                <w:b w:val="0"/>
+              </w:rPr>
+              <w:t>Secondary AC voltage (Vs)</w:t>
             </w:r>
           </w:p>
         </w:tc>
         <w:tc>
           <w:tcPr>
-            <w:tcW w:type="dxa" w:w="2131"/>
+            <w:tcW w:w="2579" w:type="dxa"/>
+            <w:shd w:val="clear" w:color="auto" w:fill="EAF2F7"/>
+            <w:vAlign w:val="center"/>
           </w:tcPr>
           <w:p>
             <w:r>
-              <w:t>Vneighbor / Vsource</w:t>
+              <w:rPr>
+                <w:b w:val="0"/>
+              </w:rPr>
             </w:r>
           </w:p>
         </w:tc>
         <w:tc>
           <w:tcPr>
-            <w:tcW w:type="dxa" w:w="2131"/>
+            <w:tcW w:w="2809" w:type="dxa"/>
+            <w:shd w:val="clear" w:color="auto" w:fill="EAF2F7"/>
+            <w:vAlign w:val="center"/>
           </w:tcPr>
           <w:p>
             <w:r>
-              <w:t>What changed?</w:t>
+              <w:rPr>
+                <w:b w:val="0"/>
+              </w:rPr>
+            </w:r>
+          </w:p>
+        </w:tc>
+        <w:tc>
+          <w:tcPr>
+            <w:tcW w:w="3621" w:type="dxa"/>
+            <w:shd w:val="clear" w:color="auto" w:fill="EAF2F7"/>
+          </w:tcPr>
+          <w:p>
+            <w:r>
+              <w:rPr>
+                <w:b w:val="0"/>
+              </w:rPr>
             </w:r>
           </w:p>
         </w:tc>
       </w:tr>
       <w:tr>
+        <w:trPr>
+          <w:trHeight w:val="490"/>
+        </w:trPr>
         <w:tc>
           <w:tcPr>
-            <w:tcW w:type="dxa" w:w="2131"/>
+            <w:tcW w:w="2178" w:type="dxa"/>
+            <w:shd w:val="clear" w:color="auto" w:fill="EAF2F7"/>
+            <w:vAlign w:val="center"/>
           </w:tcPr>
           <w:p>
             <w:r>
-              <w:t>Source disabled</w:t>
+              <w:rPr>
+                <w:b w:val="0"/>
+              </w:rPr>
+              <w:t>Measured ratio (Vs / Vp)</w:t>
             </w:r>
           </w:p>
         </w:tc>
         <w:tc>
           <w:tcPr>
-            <w:tcW w:type="dxa" w:w="2131"/>
-          </w:tcPr>
-          <w:p/>
-        </w:tc>
-        <w:tc>
-          <w:tcPr>
-            <w:tcW w:type="dxa" w:w="2131"/>
-          </w:tcPr>
-          <w:p/>
-        </w:tc>
-        <w:tc>
-          <w:tcPr>
-            <w:tcW w:type="dxa" w:w="2131"/>
-          </w:tcPr>
-          <w:p/>
-        </w:tc>
-        <w:tc>
-          <w:tcPr>
-            <w:tcW w:type="dxa" w:w="2131"/>
-          </w:tcPr>
-          <w:p/>
-        </w:tc>
-      </w:tr>
-      <w:tr>
-        <w:tc>
-          <w:tcPr>
-            <w:tcW w:type="dxa" w:w="2131"/>
+            <w:tcW w:w="2579" w:type="dxa"/>
+            <w:shd w:val="clear" w:color="auto" w:fill="EAF2F7"/>
+            <w:vAlign w:val="center"/>
           </w:tcPr>
           <w:p>
             <w:r>
-              <w:t>Parallel baseline</w:t>
+              <w:rPr>
+                <w:b w:val="0"/>
+              </w:rPr>
             </w:r>
           </w:p>
         </w:tc>
         <w:tc>
           <w:tcPr>
-            <w:tcW w:type="dxa" w:w="2131"/>
-          </w:tcPr>
-          <w:p/>
-        </w:tc>
-        <w:tc>
-          <w:tcPr>
-            <w:tcW w:type="dxa" w:w="2131"/>
-          </w:tcPr>
-          <w:p/>
-        </w:tc>
-        <w:tc>
-          <w:tcPr>
-            <w:tcW w:type="dxa" w:w="2131"/>
-          </w:tcPr>
-          <w:p/>
-        </w:tc>
-        <w:tc>
-          <w:tcPr>
-            <w:tcW w:type="dxa" w:w="2131"/>
-          </w:tcPr>
-          <w:p/>
-        </w:tc>
-      </w:tr>
-      <w:tr>
-        <w:tc>
-          <w:tcPr>
-            <w:tcW w:type="dxa" w:w="2131"/>
+            <w:tcW w:w="2809" w:type="dxa"/>
+            <w:shd w:val="clear" w:color="auto" w:fill="EAF2F7"/>
+            <w:vAlign w:val="center"/>
           </w:tcPr>
           <w:p>
             <w:r>
-              <w:t>90-degree crossing</w:t>
+              <w:rPr>
+                <w:b w:val="0"/>
+              </w:rPr>
             </w:r>
           </w:p>
         </w:tc>
         <w:tc>
           <w:tcPr>
-            <w:tcW w:type="dxa" w:w="2131"/>
-          </w:tcPr>
-          <w:p/>
-        </w:tc>
-        <w:tc>
-          <w:tcPr>
-            <w:tcW w:type="dxa" w:w="2131"/>
-          </w:tcPr>
-          <w:p/>
-        </w:tc>
-        <w:tc>
-          <w:tcPr>
-            <w:tcW w:type="dxa" w:w="2131"/>
-          </w:tcPr>
-          <w:p/>
-        </w:tc>
-        <w:tc>
-          <w:tcPr>
-            <w:tcW w:type="dxa" w:w="2131"/>
-          </w:tcPr>
-          <w:p/>
-        </w:tc>
-      </w:tr>
-      <w:tr>
-        <w:tc>
-          <w:tcPr>
-            <w:tcW w:type="dxa" w:w="2131"/>
+            <w:tcW w:w="3621" w:type="dxa"/>
+            <w:shd w:val="clear" w:color="auto" w:fill="EAF2F7"/>
           </w:tcPr>
           <w:p>
             <w:r>
-              <w:t>Restored parallel baseline</w:t>
+              <w:rPr>
+                <w:b w:val="0"/>
+              </w:rPr>
             </w:r>
           </w:p>
-        </w:tc>
-        <w:tc>
-          <w:tcPr>
-            <w:tcW w:type="dxa" w:w="2131"/>
-          </w:tcPr>
-          <w:p/>
-        </w:tc>
-        <w:tc>
-          <w:tcPr>
-            <w:tcW w:type="dxa" w:w="2131"/>
-          </w:tcPr>
-          <w:p/>
-        </w:tc>
-        <w:tc>
-          <w:tcPr>
-            <w:tcW w:type="dxa" w:w="2131"/>
-          </w:tcPr>
-          <w:p/>
-        </w:tc>
-        <w:tc>
-          <w:tcPr>
-            <w:tcW w:type="dxa" w:w="2131"/>
-          </w:tcPr>
-          <w:p/>
         </w:tc>
       </w:tr>
     </w:tbl>
     <w:p>
+      <w:pPr>
+        <w:spacing w:after="200"/>
+        <w:rPr>
+          <w:i/>
+          <w:iCs/>
+        </w:rPr>
+      </w:pPr>
       <w:r>
-        <w:t>Did the 90-degree crossing increase or reduce crosstalk? Cite the measurements and explain why restoring the parallel baseline matters.</w:t>
+        <w:rPr>
+          <w:i/>
+          <w:iCs/>
+        </w:rPr>
+        <w:t>What does the primary-to-secondary resistance result demonstrate? What does it not prove?</w:t>
       </w:r>
     </w:p>
     <w:p>
+      <w:pPr>
+        <w:spacing w:after="200"/>
+        <w:rPr>
+          <w:i/>
+          <w:iCs/>
+        </w:rPr>
+      </w:pPr>
       <w:r>
-        <w:t>________________________________________________________________________________</w:t>
-      </w:r>
-    </w:p>
-    <w:p>
-      <w:r>
-        <w:t>________________________________________________________________________________</w:t>
+        <w:rPr>
+          <w:i/>
+          <w:iCs/>
+        </w:rPr>
+        <w:t>How closely did the measured voltage ratio agree with the nameplate ratio?</w:t>
       </w:r>
     </w:p>
     <w:p>
@@ -637,165 +770,604 @@
         <w:pStyle w:val="Heading1"/>
       </w:pPr>
       <w:r>
-        <w:t>Table 3 - Neighbor-Line Resistance and Crosstalk (25)</w:t>
+        <w:t>Table 2 - Crosstalk Baseline and Orientation (20)</w:t>
+      </w:r>
+      <w:r>
+        <w:t xml:space="preserve"/>
       </w:r>
     </w:p>
     <w:p>
       <w:r>
-        <w:t>Restore the parallel baseline. Change only the neighbor-line resistor and keep the source, conductors, and scope settings fixed.</w:t>
+        <w:t>Source settings: waveform __________  frequency __________  amplitude __________  offset __________</w:t>
+      </w:r>
+    </w:p>
+    <w:p>
+      <w:r>
+        <w:t>Geometry: parallel overlap __________  spacing __________  Recovery or fallback used? __________</w:t>
       </w:r>
     </w:p>
     <w:tbl>
       <w:tblPr>
         <w:tblStyle w:val="TableGrid"/>
-        <w:tblW w:type="auto" w:w="0"/>
-        <w:tblLook w:firstColumn="1" w:firstRow="1" w:lastColumn="0" w:lastRow="0" w:noHBand="0" w:noVBand="1" w:val="04A0"/>
+        <w:tblW w:w="0" w:type="auto"/>
+        <w:tblLook w:val="04A0" w:firstRow="1" w:lastRow="0" w:firstColumn="1" w:lastColumn="0" w:noHBand="0" w:noVBand="1"/>
       </w:tblPr>
       <w:tblGrid>
-        <w:gridCol w:w="2131"/>
-        <w:gridCol w:w="2131"/>
-        <w:gridCol w:w="2131"/>
-        <w:gridCol w:w="2131"/>
-        <w:gridCol w:w="2131"/>
+        <w:gridCol w:w="2797"/>
+        <w:gridCol w:w="2664"/>
+        <w:gridCol w:w="2676"/>
+        <w:gridCol w:w="2735"/>
       </w:tblGrid>
       <w:tr>
+        <w:trPr>
+          <w:trHeight w:val="432"/>
+          <w:tblHeader/>
+        </w:trPr>
         <w:tc>
           <w:tcPr>
-            <w:tcW w:type="dxa" w:w="2131"/>
+            <w:tcW w:w="2797" w:type="dxa"/>
+            <w:shd w:val="clear" w:color="auto" w:fill="17324D"/>
+            <w:vAlign w:val="center"/>
           </w:tcPr>
           <w:p>
             <w:r>
+              <w:rPr>
+                <w:b/>
+                <w:color w:val="FFFFFF"/>
+              </w:rPr>
+              <w:t>Condition</w:t>
+            </w:r>
+          </w:p>
+        </w:tc>
+        <w:tc>
+          <w:tcPr>
+            <w:tcW w:w="2664" w:type="dxa"/>
+            <w:shd w:val="clear" w:color="auto" w:fill="17324D"/>
+            <w:vAlign w:val="center"/>
+          </w:tcPr>
+          <w:p>
+            <w:r>
+              <w:rPr>
+                <w:b/>
+                <w:color w:val="FFFFFF"/>
+              </w:rPr>
+              <w:t>Source Vpp</w:t>
+            </w:r>
+          </w:p>
+        </w:tc>
+        <w:tc>
+          <w:tcPr>
+            <w:tcW w:w="2676" w:type="dxa"/>
+            <w:shd w:val="clear" w:color="auto" w:fill="17324D"/>
+            <w:vAlign w:val="center"/>
+          </w:tcPr>
+          <w:p>
+            <w:r>
+              <w:rPr>
+                <w:b/>
+                <w:color w:val="FFFFFF"/>
+              </w:rPr>
+              <w:t>Neighbor Vpp</w:t>
+            </w:r>
+          </w:p>
+        </w:tc>
+        <w:tc>
+          <w:tcPr>
+            <w:tcW w:w="2735" w:type="dxa"/>
+            <w:shd w:val="clear" w:color="auto" w:fill="17324D"/>
+            <w:vAlign w:val="center"/>
+          </w:tcPr>
+          <w:p>
+            <w:r>
+              <w:rPr>
+                <w:b/>
+                <w:color w:val="FFFFFF"/>
+              </w:rPr>
+              <w:t>Vneighbor / Vsource</w:t>
+            </w:r>
+          </w:p>
+        </w:tc>
+      </w:tr>
+      <w:tr>
+        <w:trPr>
+          <w:trHeight w:val="490"/>
+        </w:trPr>
+        <w:tc>
+          <w:tcPr>
+            <w:tcW w:w="2797" w:type="dxa"/>
+            <w:shd w:val="clear" w:color="auto" w:fill="EAF2F7"/>
+            <w:vAlign w:val="center"/>
+          </w:tcPr>
+          <w:p>
+            <w:r>
+              <w:rPr>
+                <w:b w:val="0"/>
+              </w:rPr>
+              <w:t>Source disabled</w:t>
+            </w:r>
+          </w:p>
+        </w:tc>
+        <w:tc>
+          <w:tcPr>
+            <w:tcW w:w="2664" w:type="dxa"/>
+            <w:shd w:val="clear" w:color="auto" w:fill="EAF2F7"/>
+            <w:vAlign w:val="center"/>
+          </w:tcPr>
+          <w:p>
+            <w:r>
+              <w:rPr>
+                <w:b w:val="0"/>
+              </w:rPr>
+            </w:r>
+          </w:p>
+        </w:tc>
+        <w:tc>
+          <w:tcPr>
+            <w:tcW w:w="2676" w:type="dxa"/>
+            <w:shd w:val="clear" w:color="auto" w:fill="EAF2F7"/>
+            <w:vAlign w:val="center"/>
+          </w:tcPr>
+          <w:p>
+            <w:r>
+              <w:rPr>
+                <w:b w:val="0"/>
+              </w:rPr>
+            </w:r>
+          </w:p>
+        </w:tc>
+        <w:tc>
+          <w:tcPr>
+            <w:tcW w:w="2735" w:type="dxa"/>
+            <w:shd w:val="clear" w:color="auto" w:fill="EAF2F7"/>
+            <w:vAlign w:val="center"/>
+          </w:tcPr>
+          <w:p>
+            <w:r>
+              <w:rPr>
+                <w:b w:val="0"/>
+              </w:rPr>
+            </w:r>
+          </w:p>
+        </w:tc>
+      </w:tr>
+      <w:tr>
+        <w:trPr>
+          <w:trHeight w:val="490"/>
+        </w:trPr>
+        <w:tc>
+          <w:tcPr>
+            <w:tcW w:w="2797" w:type="dxa"/>
+            <w:vAlign w:val="center"/>
+          </w:tcPr>
+          <w:p>
+            <w:r>
+              <w:rPr>
+                <w:b w:val="0"/>
+              </w:rPr>
+              <w:t>Parallel baseline</w:t>
+            </w:r>
+          </w:p>
+        </w:tc>
+        <w:tc>
+          <w:tcPr>
+            <w:tcW w:w="2664" w:type="dxa"/>
+            <w:vAlign w:val="center"/>
+          </w:tcPr>
+          <w:p>
+            <w:r>
+              <w:rPr>
+                <w:b w:val="0"/>
+              </w:rPr>
+            </w:r>
+          </w:p>
+        </w:tc>
+        <w:tc>
+          <w:tcPr>
+            <w:tcW w:w="2676" w:type="dxa"/>
+            <w:vAlign w:val="center"/>
+          </w:tcPr>
+          <w:p>
+            <w:r>
+              <w:rPr>
+                <w:b w:val="0"/>
+              </w:rPr>
+            </w:r>
+          </w:p>
+        </w:tc>
+        <w:tc>
+          <w:tcPr>
+            <w:tcW w:w="2735" w:type="dxa"/>
+            <w:vAlign w:val="center"/>
+          </w:tcPr>
+          <w:p>
+            <w:r>
+              <w:rPr>
+                <w:b w:val="0"/>
+              </w:rPr>
+            </w:r>
+          </w:p>
+        </w:tc>
+      </w:tr>
+      <w:tr>
+        <w:trPr>
+          <w:trHeight w:val="490"/>
+        </w:trPr>
+        <w:tc>
+          <w:tcPr>
+            <w:tcW w:w="2797" w:type="dxa"/>
+            <w:shd w:val="clear" w:color="auto" w:fill="EAF2F7"/>
+            <w:vAlign w:val="center"/>
+          </w:tcPr>
+          <w:p>
+            <w:r>
+              <w:rPr>
+                <w:b w:val="0"/>
+              </w:rPr>
+              <w:t>90-degree crossing</w:t>
+            </w:r>
+          </w:p>
+        </w:tc>
+        <w:tc>
+          <w:tcPr>
+            <w:tcW w:w="2664" w:type="dxa"/>
+            <w:shd w:val="clear" w:color="auto" w:fill="EAF2F7"/>
+            <w:vAlign w:val="center"/>
+          </w:tcPr>
+          <w:p>
+            <w:r>
+              <w:rPr>
+                <w:b w:val="0"/>
+              </w:rPr>
+            </w:r>
+          </w:p>
+        </w:tc>
+        <w:tc>
+          <w:tcPr>
+            <w:tcW w:w="2676" w:type="dxa"/>
+            <w:shd w:val="clear" w:color="auto" w:fill="EAF2F7"/>
+            <w:vAlign w:val="center"/>
+          </w:tcPr>
+          <w:p>
+            <w:r>
+              <w:rPr>
+                <w:b w:val="0"/>
+              </w:rPr>
+            </w:r>
+          </w:p>
+        </w:tc>
+        <w:tc>
+          <w:tcPr>
+            <w:tcW w:w="2735" w:type="dxa"/>
+            <w:shd w:val="clear" w:color="auto" w:fill="EAF2F7"/>
+            <w:vAlign w:val="center"/>
+          </w:tcPr>
+          <w:p>
+            <w:r>
+              <w:rPr>
+                <w:b w:val="0"/>
+              </w:rPr>
+            </w:r>
+          </w:p>
+        </w:tc>
+      </w:tr>
+      <w:tr>
+        <w:trPr>
+          <w:trHeight w:val="490"/>
+        </w:trPr>
+        <w:tc>
+          <w:tcPr>
+            <w:tcW w:w="2797" w:type="dxa"/>
+            <w:vAlign w:val="center"/>
+          </w:tcPr>
+          <w:p>
+            <w:r>
+              <w:rPr>
+                <w:b w:val="0"/>
+              </w:rPr>
+              <w:t>Restored parallel baseline</w:t>
+            </w:r>
+          </w:p>
+        </w:tc>
+        <w:tc>
+          <w:tcPr>
+            <w:tcW w:w="2664" w:type="dxa"/>
+            <w:vAlign w:val="center"/>
+          </w:tcPr>
+          <w:p>
+            <w:r>
+              <w:rPr>
+                <w:b w:val="0"/>
+              </w:rPr>
+            </w:r>
+          </w:p>
+        </w:tc>
+        <w:tc>
+          <w:tcPr>
+            <w:tcW w:w="2676" w:type="dxa"/>
+            <w:vAlign w:val="center"/>
+          </w:tcPr>
+          <w:p>
+            <w:r>
+              <w:rPr>
+                <w:b w:val="0"/>
+              </w:rPr>
+            </w:r>
+          </w:p>
+        </w:tc>
+        <w:tc>
+          <w:tcPr>
+            <w:tcW w:w="2735" w:type="dxa"/>
+            <w:vAlign w:val="center"/>
+          </w:tcPr>
+          <w:p>
+            <w:r>
+              <w:rPr>
+                <w:b w:val="0"/>
+              </w:rPr>
+            </w:r>
+          </w:p>
+        </w:tc>
+      </w:tr>
+    </w:tbl>
+    <w:p>
+      <w:pPr>
+        <w:spacing w:after="200"/>
+        <w:rPr>
+          <w:i/>
+          <w:iCs/>
+        </w:rPr>
+      </w:pPr>
+      <w:r>
+        <w:rPr>
+          <w:i/>
+          <w:iCs/>
+        </w:rPr>
+        <w:t>Did the 90-degree crossing reduce crosstalk? Cite the measurements and explain why restoring the baseline matters.</w:t>
+      </w:r>
+    </w:p>
+    <w:p>
+      <w:r>
+        <w:br/>
+      </w:r>
+    </w:p>
+    <w:p>
+      <w:pPr>
+        <w:pStyle w:val="Heading1"/>
+      </w:pPr>
+      <w:r>
+        <w:t>Table 3 - Neighbor-Line Resistance and Crosstalk (25)</w:t>
+      </w:r>
+      <w:r>
+        <w:t xml:space="preserve"/>
+      </w:r>
+    </w:p>
+    <w:tbl>
+      <w:tblPr>
+        <w:tblStyle w:val="TableGrid"/>
+        <w:tblW w:w="0" w:type="auto"/>
+        <w:tblLook w:val="04A0" w:firstRow="1" w:lastRow="0" w:firstColumn="1" w:lastColumn="0" w:noHBand="0" w:noVBand="1"/>
+      </w:tblPr>
+      <w:tblGrid>
+        <w:gridCol w:w="2797"/>
+        <w:gridCol w:w="2664"/>
+        <w:gridCol w:w="2676"/>
+        <w:gridCol w:w="2735"/>
+      </w:tblGrid>
+      <w:tr>
+        <w:trPr>
+          <w:trHeight w:val="432"/>
+          <w:tblHeader/>
+        </w:trPr>
+        <w:tc>
+          <w:tcPr>
+            <w:tcW w:w="2797" w:type="dxa"/>
+            <w:shd w:val="clear" w:color="auto" w:fill="17324D"/>
+            <w:vAlign w:val="center"/>
+          </w:tcPr>
+          <w:p>
+            <w:r>
+              <w:rPr>
+                <w:b/>
+                <w:color w:val="FFFFFF"/>
+              </w:rPr>
               <w:t>Neighbor condition</w:t>
             </w:r>
           </w:p>
         </w:tc>
         <w:tc>
           <w:tcPr>
-            <w:tcW w:type="dxa" w:w="2131"/>
+            <w:tcW w:w="2664" w:type="dxa"/>
+            <w:shd w:val="clear" w:color="auto" w:fill="17324D"/>
+            <w:vAlign w:val="center"/>
           </w:tcPr>
           <w:p>
             <w:r>
+              <w:rPr>
+                <w:b/>
+                <w:color w:val="FFFFFF"/>
+              </w:rPr>
               <w:t>Resistance</w:t>
             </w:r>
           </w:p>
         </w:tc>
         <w:tc>
           <w:tcPr>
-            <w:tcW w:type="dxa" w:w="2131"/>
+            <w:tcW w:w="2676" w:type="dxa"/>
+            <w:shd w:val="clear" w:color="auto" w:fill="17324D"/>
+            <w:vAlign w:val="center"/>
           </w:tcPr>
           <w:p>
             <w:r>
+              <w:rPr>
+                <w:b/>
+                <w:color w:val="FFFFFF"/>
+              </w:rPr>
               <w:t>Source Vpp</w:t>
             </w:r>
           </w:p>
         </w:tc>
         <w:tc>
           <w:tcPr>
-            <w:tcW w:type="dxa" w:w="2131"/>
+            <w:tcW w:w="2735" w:type="dxa"/>
+            <w:shd w:val="clear" w:color="auto" w:fill="17324D"/>
+            <w:vAlign w:val="center"/>
           </w:tcPr>
           <w:p>
             <w:r>
+              <w:rPr>
+                <w:b/>
+                <w:color w:val="FFFFFF"/>
+              </w:rPr>
               <w:t>Neighbor Vpp</w:t>
-            </w:r>
-          </w:p>
-        </w:tc>
-        <w:tc>
-          <w:tcPr>
-            <w:tcW w:type="dxa" w:w="2131"/>
-          </w:tcPr>
-          <w:p>
-            <w:r>
-              <w:t>Reduction vs. high R (%)</w:t>
             </w:r>
           </w:p>
         </w:tc>
       </w:tr>
       <w:tr>
+        <w:trPr>
+          <w:trHeight w:val="490"/>
+        </w:trPr>
         <w:tc>
           <w:tcPr>
-            <w:tcW w:type="dxa" w:w="2131"/>
+            <w:tcW w:w="2797" w:type="dxa"/>
+            <w:vAlign w:val="center"/>
           </w:tcPr>
           <w:p>
             <w:r>
+              <w:rPr>
+                <w:b w:val="0"/>
+              </w:rPr>
               <w:t>High-value neighbor resistor</w:t>
             </w:r>
           </w:p>
         </w:tc>
         <w:tc>
           <w:tcPr>
-            <w:tcW w:type="dxa" w:w="2131"/>
+            <w:tcW w:w="2664" w:type="dxa"/>
+            <w:vAlign w:val="center"/>
           </w:tcPr>
-          <w:p/>
+          <w:p>
+            <w:r>
+              <w:rPr>
+                <w:b w:val="0"/>
+              </w:rPr>
+            </w:r>
+          </w:p>
         </w:tc>
         <w:tc>
           <w:tcPr>
-            <w:tcW w:type="dxa" w:w="2131"/>
+            <w:tcW w:w="2676" w:type="dxa"/>
+            <w:vAlign w:val="center"/>
           </w:tcPr>
-          <w:p/>
+          <w:p>
+            <w:r>
+              <w:rPr>
+                <w:b w:val="0"/>
+              </w:rPr>
+            </w:r>
+          </w:p>
         </w:tc>
         <w:tc>
           <w:tcPr>
-            <w:tcW w:type="dxa" w:w="2131"/>
+            <w:tcW w:w="2735" w:type="dxa"/>
+            <w:vAlign w:val="center"/>
           </w:tcPr>
-          <w:p/>
-        </w:tc>
-        <w:tc>
-          <w:tcPr>
-            <w:tcW w:type="dxa" w:w="2131"/>
-          </w:tcPr>
-          <w:p/>
+          <w:p>
+            <w:r>
+              <w:rPr>
+                <w:b w:val="0"/>
+              </w:rPr>
+            </w:r>
+          </w:p>
         </w:tc>
       </w:tr>
       <w:tr>
+        <w:trPr>
+          <w:trHeight w:val="490"/>
+        </w:trPr>
         <w:tc>
           <w:tcPr>
-            <w:tcW w:type="dxa" w:w="2131"/>
+            <w:tcW w:w="2797" w:type="dxa"/>
+            <w:shd w:val="clear" w:color="auto" w:fill="EAF2F7"/>
+            <w:vAlign w:val="center"/>
           </w:tcPr>
           <w:p>
             <w:r>
+              <w:rPr>
+                <w:b w:val="0"/>
+              </w:rPr>
               <w:t>Low-value neighbor resistor</w:t>
             </w:r>
           </w:p>
         </w:tc>
         <w:tc>
           <w:tcPr>
-            <w:tcW w:type="dxa" w:w="2131"/>
+            <w:tcW w:w="2664" w:type="dxa"/>
+            <w:shd w:val="clear" w:color="auto" w:fill="EAF2F7"/>
+            <w:vAlign w:val="center"/>
           </w:tcPr>
-          <w:p/>
+          <w:p>
+            <w:r>
+              <w:rPr>
+                <w:b w:val="0"/>
+              </w:rPr>
+            </w:r>
+          </w:p>
         </w:tc>
         <w:tc>
           <w:tcPr>
-            <w:tcW w:type="dxa" w:w="2131"/>
+            <w:tcW w:w="2676" w:type="dxa"/>
+            <w:shd w:val="clear" w:color="auto" w:fill="EAF2F7"/>
+            <w:vAlign w:val="center"/>
           </w:tcPr>
-          <w:p/>
+          <w:p>
+            <w:r>
+              <w:rPr>
+                <w:b w:val="0"/>
+              </w:rPr>
+            </w:r>
+          </w:p>
         </w:tc>
         <w:tc>
           <w:tcPr>
-            <w:tcW w:type="dxa" w:w="2131"/>
+            <w:tcW w:w="2735" w:type="dxa"/>
+            <w:shd w:val="clear" w:color="auto" w:fill="EAF2F7"/>
+            <w:vAlign w:val="center"/>
           </w:tcPr>
-          <w:p/>
-        </w:tc>
-        <w:tc>
-          <w:tcPr>
-            <w:tcW w:type="dxa" w:w="2131"/>
-          </w:tcPr>
-          <w:p/>
+          <w:p>
+            <w:r>
+              <w:rPr>
+                <w:b w:val="0"/>
+              </w:rPr>
+            </w:r>
+          </w:p>
         </w:tc>
       </w:tr>
     </w:tbl>
     <w:p>
       <w:r>
-        <w:t>How did lower neighbor-line resistance affect measured crosstalk? State the quantitative evidence and one design tradeoff.</w:t>
+        <w:t>Neighbor-voltage reduction = 100(1 - Vlow / Vhigh) = __________________ %</w:t>
+      </w:r>
+    </w:p>
+    <w:p>
+      <w:pPr>
+        <w:spacing w:after="200"/>
+        <w:rPr>
+          <w:i/>
+          <w:iCs/>
+        </w:rPr>
+      </w:pPr>
+      <w:r>
+        <w:rPr>
+          <w:i/>
+          <w:iCs/>
+        </w:rPr>
+        <w:t>How did lower neighbor-line resistance affect crosstalk? State the evidence and one design tradeoff.</w:t>
       </w:r>
     </w:p>
     <w:p>
       <w:r>
-        <w:t>________________________________________________________________________________</w:t>
-      </w:r>
-    </w:p>
-    <w:p>
-      <w:r>
-        <w:t>________________________________________________________________________________</w:t>
+        <w:br w:type="page"/>
       </w:r>
     </w:p>
     <w:p>
@@ -805,10 +1377,13 @@
       <w:r>
         <w:t>Evidence (15)</w:t>
       </w:r>
+      <w:r>
+        <w:t xml:space="preserve"/>
+      </w:r>
     </w:p>
     <w:p>
       <w:r>
-        <w:t>Insert readable photographs or screenshots for the required evidence points:</w:t>
+        <w:t>Insert a readable photo or screenshot for each scenario:</w:t>
       </w:r>
     </w:p>
     <w:p>
@@ -826,6 +1401,8 @@
     </w:p>
     <w:p>
       <w:r>
+        <w:br/>
+        <w:br/>
         <w:br/>
         <w:br/>
       </w:r>
@@ -847,6 +1424,8 @@
       <w:r>
         <w:br/>
         <w:br/>
+        <w:br/>
+        <w:br/>
       </w:r>
     </w:p>
     <w:p>
@@ -859,11 +1438,13 @@
     </w:p>
     <w:p>
       <w:r>
-        <w:t>Pictured: The tested orientation or neighbor-resistance condition that produced the lowest repeatable neighbor-line voltage.</w:t>
+        <w:t>Pictured: The tested condition that produced the lowest repeatable neighbor-line voltage.</w:t>
       </w:r>
     </w:p>
     <w:p>
       <w:r>
+        <w:br/>
+        <w:br/>
         <w:br/>
         <w:br/>
       </w:r>
@@ -880,75 +1461,166 @@
       <w:r>
         <w:t>Conclusion (15)</w:t>
       </w:r>
+      <w:r>
+        <w:t xml:space="preserve"/>
+      </w:r>
     </w:p>
     <w:p>
+      <w:pPr>
+        <w:rPr>
+          <w:i/>
+          <w:iCs/>
+        </w:rPr>
+      </w:pPr>
       <w:r>
-        <w:t>Summarize what you did and learned, then address each prompt:</w:t>
+        <w:rPr>
+          <w:i/>
+          <w:iCs/>
+        </w:rPr>
+        <w:t xml:space="preserve">Give a summary of what you did and learned. In addition, answer these questions:</w:t>
+      </w:r>
+      <w:r>
+        <w:rPr>
+          <w:i/>
+          <w:iCs/>
+        </w:rPr>
+        <w:t/>
+      </w:r>
+      <w:r>
+        <w:rPr>
+          <w:i/>
+          <w:iCs/>
+        </w:rPr>
+        <w:t xml:space="preserve"/>
+      </w:r>
+      <w:r>
+        <w:rPr>
+          <w:i/>
+          <w:iCs/>
+        </w:rPr>
+        <w:t xml:space="preserve"/>
+      </w:r>
+      <w:r>
+        <w:rPr>
+          <w:i/>
+          <w:iCs/>
+        </w:rPr>
+        <w:t/>
+      </w:r>
+      <w:r>
+        <w:rPr>
+          <w:i/>
+          <w:iCs/>
+        </w:rPr>
+        <w:t xml:space="preserve"/>
       </w:r>
     </w:p>
     <w:p>
       <w:pPr>
         <w:pStyle w:val="ListParagraph"/>
+        <w:numPr>
+          <w:ilvl w:val="0"/>
+          <w:numId w:val="10"/>
+        </w:numPr>
+        <w:rPr>
+          <w:i/>
+          <w:iCs/>
+        </w:rPr>
       </w:pPr>
       <w:r>
-        <w:t>How did the transformer demonstrate intentional coupling without a direct DC path between windings?</w:t>
+        <w:rPr>
+          <w:i/>
+          <w:iCs/>
+        </w:rPr>
+        <w:t xml:space="preserve">How did the transformer demonstrate intentional coupling without a direct DC path between windings?</w:t>
+      </w:r>
+      <w:r>
+        <w:rPr>
+          <w:i/>
+          <w:iCs/>
+        </w:rPr>
+        <w:t/>
       </w:r>
     </w:p>
     <w:p>
       <w:pPr>
         <w:pStyle w:val="ListParagraph"/>
+        <w:numPr>
+          <w:ilvl w:val="0"/>
+          <w:numId w:val="10"/>
+        </w:numPr>
+        <w:rPr>
+          <w:i/>
+          <w:iCs/>
+        </w:rPr>
       </w:pPr>
       <w:r>
-        <w:t>How did you verify that the unwanted waveform on the neighbor line came from the source line?</w:t>
+        <w:rPr>
+          <w:i/>
+          <w:iCs/>
+        </w:rPr>
+        <w:t xml:space="preserve">How did the source-off check support the conclusion that the neighbor waveform came from the source line?</w:t>
+      </w:r>
+      <w:r>
+        <w:rPr>
+          <w:i/>
+          <w:iCs/>
+        </w:rPr>
+        <w:t/>
       </w:r>
     </w:p>
     <w:p>
       <w:pPr>
         <w:pStyle w:val="ListParagraph"/>
+        <w:numPr>
+          <w:ilvl w:val="0"/>
+          <w:numId w:val="10"/>
+        </w:numPr>
+        <w:rPr>
+          <w:i/>
+          <w:iCs/>
+        </w:rPr>
       </w:pPr>
       <w:r>
-        <w:t>Which tested change reduced crosstalk most, and what quantitative evidence supports that conclusion?</w:t>
+        <w:rPr>
+          <w:i/>
+          <w:iCs/>
+        </w:rPr>
+        <w:t xml:space="preserve">Which tested change reduced crosstalk most, and what quantitative evidence supports that conclusion?</w:t>
+      </w:r>
+      <w:r>
+        <w:rPr>
+          <w:i/>
+          <w:iCs/>
+        </w:rPr>
+        <w:t/>
       </w:r>
     </w:p>
     <w:p>
       <w:pPr>
         <w:pStyle w:val="ListParagraph"/>
+        <w:numPr>
+          <w:ilvl w:val="0"/>
+          <w:numId w:val="10"/>
+        </w:numPr>
+        <w:rPr>
+          <w:i/>
+          <w:iCs/>
+        </w:rPr>
       </w:pPr>
       <w:r>
-        <w:t>Name one controlled variable and explain why it was necessary for a fair comparison.</w:t>
+        <w:rPr>
+          <w:i/>
+          <w:iCs/>
+        </w:rPr>
+        <w:t xml:space="preserve">What is one broader claim about isolation or signal containment that this lab does not prove?</w:t>
       </w:r>
-    </w:p>
-    <w:p>
-      <w:pPr>
-        <w:pStyle w:val="ListParagraph"/>
-      </w:pPr>
       <w:r>
-        <w:t>State one broader claim about interception, isolation, or signal containment that this evidence does not prove.</w:t>
-      </w:r>
-    </w:p>
-    <w:p>
-      <w:r>
-        <w:t>________________________________________________________________________________</w:t>
-      </w:r>
-    </w:p>
-    <w:p>
-      <w:r>
-        <w:t>________________________________________________________________________________</w:t>
-      </w:r>
-    </w:p>
-    <w:p>
-      <w:r>
-        <w:t>________________________________________________________________________________</w:t>
-      </w:r>
-    </w:p>
-    <w:p>
-      <w:r>
-        <w:t>________________________________________________________________________________</w:t>
-      </w:r>
-    </w:p>
-    <w:p>
-      <w:r>
-        <w:t>________________________________________________________________________________</w:t>
+        <w:rPr>
+          <w:i/>
+          <w:iCs/>
+        </w:rPr>
+        <w:t/>
       </w:r>
     </w:p>
     <w:sectPr>
@@ -1739,7 +2411,7 @@
   <w:style w:type="paragraph" w:default="1" w:styleId="Normal">
     <w:name w:val="Normal"/>
     <w:qFormat/>
-    <w:rsid w:val="0025644F"/>
+    <w:rsid w:val="009D2B7E"/>
     <w:pPr>
       <w:spacing w:after="80"/>
     </w:pPr>

</xml_diff>